<commit_message>
Mise à jour du 28 octobre : PDF joint au dossier (une version), PDF du plan, écran allégé, Transmis aux RH, dates sans fr-CA ; documents à jour
Co-Authored-By: Claude Opus 5.5 <noreply@anthropic.com>
Claude-Session: https://claude.ai/code/session_01FRdAzq8p3F9gJJe5MA3G79
</commit_message>
<xml_diff>
--- a/powerapps/DOSSIER-AUTORISATION-TI.docx
+++ b/powerapps/DOSSIER-AUTORISATION-TI.docx
@@ -623,7 +623,7 @@
         <w:pStyle w:val="BlockText"/>
       </w:pPr>
       <w:r>
-        <w:t xml:space="preserve">Préalables à l’import : un site SharePoint de PréProd avec la liste Appreciations (35 colonnes), la liste Parametres, la bibliothèque Appreciations_PDF et le groupe RH – Appréciations. La structure et les autorisations sont dans l’onglet « SharePoint » du fichier Excel et dans la partie 4 du guide joint.</w:t>
+        <w:t xml:space="preserve">Préalables à l’import : un site SharePoint de PréProd avec la liste Appreciations (35 colonnes), la liste Parametres (pièces jointes activées sur Appreciations) et le groupe RH – Appréciations. La structure et les autorisations sont dans l’onglet « SharePoint » du fichier Excel et dans la partie 4 du guide joint.</w:t>
       </w:r>
     </w:p>
     <w:p>
@@ -2822,7 +2822,7 @@
         <w:pStyle w:val="Compact"/>
       </w:pPr>
       <w:r>
-        <w:t xml:space="preserve">combien de temps garder les dossiers (liste Appreciations) et les PDF (bibliothèque Appreciations_PDF) ;</w:t>
+        <w:t xml:space="preserve">combien de temps garder les dossiers (liste Appreciations) et les PDF (joints à chaque dossier) ;</w:t>
       </w:r>
     </w:p>
     <w:p>
@@ -3491,7 +3491,7 @@
               <w:jc w:val="left"/>
             </w:pPr>
             <w:r>
-              <w:t xml:space="preserve">SharePoint Online de la Ville (Microsoft 365, locataire de la Ville) : liste Appreciations, bibliothèque Appreciations_PDF</w:t>
+              <w:t xml:space="preserve">SharePoint Online de la Ville (Microsoft 365, locataire de la Ville) : liste Appreciations (le PDF est joint à chaque dossier, avec les mêmes accès)</w:t>
             </w:r>
           </w:p>
         </w:tc>
@@ -3771,7 +3771,7 @@
               <w:jc w:val="left"/>
             </w:pPr>
             <w:r>
-              <w:t xml:space="preserve">Appreciations_PDF</w:t>
+              <w:t xml:space="preserve">PDF joint au dossier</w:t>
             </w:r>
           </w:p>
         </w:tc>
@@ -3833,7 +3833,7 @@
               <w:jc w:val="left"/>
             </w:pPr>
             <w:r>
-              <w:t xml:space="preserve">Ses PDF seulement</w:t>
+              <w:t xml:space="preserve">Celui de son dossier</w:t>
             </w:r>
           </w:p>
         </w:tc>
@@ -3895,7 +3895,7 @@
               <w:jc w:val="left"/>
             </w:pPr>
             <w:r>
-              <w:t xml:space="preserve">PDF demandés seulement</w:t>
+              <w:t xml:space="preserve">Ceux de ses dossiers</w:t>
             </w:r>
           </w:p>
         </w:tc>

</xml_diff>

<commit_message>
Appréciation de la contribution : version finale (28 octobre 2026)
Tous les documents, visuels, Excel et présentation portent la mention
version finale ; ajout d'une archive ZIP regroupant les livrables.

Co-Authored-By: Claude Opus 5.5 <noreply@anthropic.com>
Claude-Session: https://claude.ai/code/session_01FRdAzq8p3F9gJJe5MA3G79
</commit_message>
<xml_diff>
--- a/powerapps/DOSSIER-AUTORISATION-TI.docx
+++ b/powerapps/DOSSIER-AUTORISATION-TI.docx
@@ -123,19 +123,25 @@
         <w:t xml:space="preserve"> </w:t>
       </w:r>
       <w:r>
-        <w:t xml:space="preserve">version</w:t>
-      </w:r>
-      <w:r>
-        <w:t xml:space="preserve"> </w:t>
-      </w:r>
-      <w:r>
-        <w:t xml:space="preserve">du</w:t>
-      </w:r>
-      <w:r>
-        <w:t xml:space="preserve"> </w:t>
-      </w:r>
-      <w:r>
-        <w:t xml:space="preserve">27</w:t>
+        <w:t xml:space="preserve">VERSION</w:t>
+      </w:r>
+      <w:r>
+        <w:t xml:space="preserve"> </w:t>
+      </w:r>
+      <w:r>
+        <w:t xml:space="preserve">FINALE</w:t>
+      </w:r>
+      <w:r>
+        <w:t xml:space="preserve"> </w:t>
+      </w:r>
+      <w:r>
+        <w:t xml:space="preserve">—</w:t>
+      </w:r>
+      <w:r>
+        <w:t xml:space="preserve"> </w:t>
+      </w:r>
+      <w:r>
+        <w:t xml:space="preserve">28</w:t>
       </w:r>
       <w:r>
         <w:t xml:space="preserve"> </w:t>

</xml_diff>

<commit_message>
Tests de l'équipe en PréProd : testeurs inclus dans la demande aux TI
Co-Authored-By: Claude Opus 5.5 <noreply@anthropic.com>
Claude-Session: https://claude.ai/code/session_01FRdAzq8p3F9gJJe5MA3G79
</commit_message>
<xml_diff>
--- a/powerapps/DOSSIER-AUTORISATION-TI.docx
+++ b/powerapps/DOSSIER-AUTORISATION-TI.docx
@@ -638,6 +638,27 @@
       </w:pPr>
       <w:r>
         <w:t xml:space="preserve">Connexions : merci d’utiliser un compte de service, propriétaire du site, pour les 4 références de connexion.</w:t>
+      </w:r>
+    </w:p>
+    <w:p>
+      <w:pPr>
+        <w:pStyle w:val="BlockText"/>
+      </w:pPr>
+      <w:r>
+        <w:t xml:space="preserve">Testeurs : merci d’ajouter au groupe de sécurité de l’environnement PréProd (et au groupe Membres du site SharePoint de PréProd) les personnes suivantes, qui feront les tests avec du contenu fictif :</w:t>
+      </w:r>
+      <w:r>
+        <w:t xml:space="preserve"> </w:t>
+      </w:r>
+      <w:r>
+        <w:rPr>
+          <w:iCs/>
+          <w:i/>
+        </w:rPr>
+        <w:t xml:space="preserve">[noms des collègues]</w:t>
+      </w:r>
+      <w:r>
+        <w:t xml:space="preserve">. Actuellement, elles reçoivent le message « You are not a member of the environment’s security group ».</w:t>
       </w:r>
     </w:p>
     <w:p>

</xml_diff>

<commit_message>
Correction du type de rencontre et paquet de transmission PréProd pour les TI
Co-Authored-By: Claude Opus 5.5 <noreply@anthropic.com>
Claude-Session: https://claude.ai/code/session_01FRdAzq8p3F9gJJe5MA3G79
</commit_message>
<xml_diff>
--- a/powerapps/DOSSIER-AUTORISATION-TI.docx
+++ b/powerapps/DOSSIER-AUTORISATION-TI.docx
@@ -501,7 +501,7 @@
               <w:jc w:val="left"/>
             </w:pPr>
             <w:r>
-              <w:t xml:space="preserve">1)</w:t>
+              <w:t xml:space="preserve">Le tout est regroupé dans</w:t>
             </w:r>
             <w:r>
               <w:t xml:space="preserve"> </w:t>
@@ -510,7 +510,22 @@
               <w:rPr>
                 <w:rStyle w:val="VerbatimChar"/>
               </w:rPr>
-              <w:t xml:space="preserve">Solution-ApplicationAppreciation_1_0_0_1_managed.zip</w:t>
+              <w:t xml:space="preserve">Transmission-TI-PreProd-Appreciation.zip</w:t>
+            </w:r>
+            <w:r>
+              <w:t xml:space="preserve"> </w:t>
+            </w:r>
+            <w:r>
+              <w:t xml:space="preserve">(voir le BORDEREAU-TRANSMISSION-TI) : 1)</w:t>
+            </w:r>
+            <w:r>
+              <w:t xml:space="preserve"> </w:t>
+            </w:r>
+            <w:r>
+              <w:rPr>
+                <w:rStyle w:val="VerbatimChar"/>
+              </w:rPr>
+              <w:t xml:space="preserve">Solution-ApplicationAppreciation_1_0_0_2_managed.zip</w:t>
             </w:r>
             <w:r>
               <w:t xml:space="preserve"> </w:t>
@@ -621,7 +636,7 @@
         <w:pStyle w:val="BlockText"/>
       </w:pPr>
       <w:r>
-        <w:t xml:space="preserve">Première mise en PréProd de la solution Solution-ApplicationAppreciation (version 1.0.0.1, gérée). Contenu : 1 application canevas, 3 flux (Appréciation – Permissions à la création, Appréciation – Suivi des étapes, GenererPDFAppreciation), 5 variables d’environnement et 4 références de connexion (SharePoint Appreciation, Utilisateurs Office 365 Appreciations, Outlook Appreciations, OneDrive Appreciations). Connecteurs standard seulement, aucune licence Premium.</w:t>
+        <w:t xml:space="preserve">Première mise en PréProd de la solution Solution-ApplicationAppreciation (version 1.0.0.2, gérée). Contenu : 1 application canevas, 3 flux (Appréciation – Permissions à la création, Appréciation – Suivi des étapes, GenererPDFAppreciation), 5 variables d’environnement et 4 références de connexion (SharePoint Appreciation, Utilisateurs Office 365 Appreciations, Outlook Appreciations, OneDrive Appreciations). Connecteurs standard seulement, aucune licence Premium.</w:t>
       </w:r>
     </w:p>
     <w:p>
@@ -776,7 +791,7 @@
         <w:pStyle w:val="Compact"/>
       </w:pPr>
       <w:r>
-        <w:t xml:space="preserve">passez en version 1.0.0.1 ;</w:t>
+        <w:t xml:space="preserve">passez en version 1.0.0.2 ;</w:t>
       </w:r>
     </w:p>
     <w:p>

</xml_diff>

<commit_message>
Dossier TI : mention de la mise à jour du 29 octobre
Co-Authored-By: Claude Opus 5.5 <noreply@anthropic.com>
Claude-Session: https://claude.ai/code/session_01FRdAzq8p3F9gJJe5MA3G79
</commit_message>
<xml_diff>
--- a/powerapps/DOSSIER-AUTORISATION-TI.docx
+++ b/powerapps/DOSSIER-AUTORISATION-TI.docx
@@ -153,7 +153,55 @@
         <w:t xml:space="preserve"> </w:t>
       </w:r>
       <w:r>
-        <w:t xml:space="preserve">2026</w:t>
+        <w:t xml:space="preserve">2026,</w:t>
+      </w:r>
+      <w:r>
+        <w:t xml:space="preserve"> </w:t>
+      </w:r>
+      <w:r>
+        <w:t xml:space="preserve">mise</w:t>
+      </w:r>
+      <w:r>
+        <w:t xml:space="preserve"> </w:t>
+      </w:r>
+      <w:r>
+        <w:t xml:space="preserve">à</w:t>
+      </w:r>
+      <w:r>
+        <w:t xml:space="preserve"> </w:t>
+      </w:r>
+      <w:r>
+        <w:t xml:space="preserve">jour</w:t>
+      </w:r>
+      <w:r>
+        <w:t xml:space="preserve"> </w:t>
+      </w:r>
+      <w:r>
+        <w:t xml:space="preserve">du</w:t>
+      </w:r>
+      <w:r>
+        <w:t xml:space="preserve"> </w:t>
+      </w:r>
+      <w:r>
+        <w:t xml:space="preserve">29</w:t>
+      </w:r>
+      <w:r>
+        <w:t xml:space="preserve"> </w:t>
+      </w:r>
+      <w:r>
+        <w:t xml:space="preserve">octobre</w:t>
+      </w:r>
+      <w:r>
+        <w:t xml:space="preserve"> </w:t>
+      </w:r>
+      <w:r>
+        <w:t xml:space="preserve">(transmission</w:t>
+      </w:r>
+      <w:r>
+        <w:t xml:space="preserve"> </w:t>
+      </w:r>
+      <w:r>
+        <w:t xml:space="preserve">PréProd)</w:t>
       </w:r>
     </w:p>
     <w:bookmarkStart w:id="21" w:name="X1384081b7cc5ac8456000d2e084fd8ed4b9d64e"/>

</xml_diff>

<commit_message>
Section B : échelle des postures de leadership à 4 niveaux, avec la note 1
Co-Authored-By: Claude Opus 5.5 <noreply@anthropic.com>
Claude-Session: https://claude.ai/code/session_01FRdAzq8p3F9gJJe5MA3G79
</commit_message>
<xml_diff>
--- a/powerapps/DOSSIER-AUTORISATION-TI.docx
+++ b/powerapps/DOSSIER-AUTORISATION-TI.docx
@@ -573,7 +573,7 @@
               <w:rPr>
                 <w:rStyle w:val="VerbatimChar"/>
               </w:rPr>
-              <w:t xml:space="preserve">Solution-ApplicationAppreciation_1_0_0_2_managed.zip</w:t>
+              <w:t xml:space="preserve">Solution-ApplicationAppreciation_1_0_0_3_managed.zip</w:t>
             </w:r>
             <w:r>
               <w:t xml:space="preserve"> </w:t>
@@ -684,7 +684,7 @@
         <w:pStyle w:val="BlockText"/>
       </w:pPr>
       <w:r>
-        <w:t xml:space="preserve">Première mise en PréProd de la solution Solution-ApplicationAppreciation (version 1.0.0.2, gérée). Contenu : 1 application canevas, 3 flux (Appréciation – Permissions à la création, Appréciation – Suivi des étapes, GenererPDFAppreciation), 5 variables d’environnement et 4 références de connexion (SharePoint Appreciation, Utilisateurs Office 365 Appreciations, Outlook Appreciations, OneDrive Appreciations). Connecteurs standard seulement, aucune licence Premium.</w:t>
+        <w:t xml:space="preserve">Première mise en PréProd de la solution Solution-ApplicationAppreciation (version 1.0.0.3, gérée). Contenu : 1 application canevas, 3 flux (Appréciation – Permissions à la création, Appréciation – Suivi des étapes, GenererPDFAppreciation), 5 variables d’environnement et 4 références de connexion (SharePoint Appreciation, Utilisateurs Office 365 Appreciations, Outlook Appreciations, OneDrive Appreciations). Connecteurs standard seulement, aucune licence Premium.</w:t>
       </w:r>
     </w:p>
     <w:p>
@@ -839,7 +839,7 @@
         <w:pStyle w:val="Compact"/>
       </w:pPr>
       <w:r>
-        <w:t xml:space="preserve">passez en version 1.0.0.2 ;</w:t>
+        <w:t xml:space="preserve">passez en version 1.0.0.3 ;</w:t>
       </w:r>
     </w:p>
     <w:p>

</xml_diff>

<commit_message>
PréProd et conformité aux exigences des TI : guide, formules, flux, documents pour Documents TI
Co-Authored-By: Claude Opus 5.5 <noreply@anthropic.com>
Claude-Session: https://claude.ai/code/session_01FRdAzq8p3F9gJJe5MA3G79
</commit_message>
<xml_diff>
--- a/powerapps/DOSSIER-AUTORISATION-TI.docx
+++ b/powerapps/DOSSIER-AUTORISATION-TI.docx
@@ -573,7 +573,7 @@
               <w:rPr>
                 <w:rStyle w:val="VerbatimChar"/>
               </w:rPr>
-              <w:t xml:space="preserve">Solution-ApplicationAppreciation_1_0_0_3_managed.zip</w:t>
+              <w:t xml:space="preserve">Solution-ApplicationAppreciation_1_0_0_4_managed.zip</w:t>
             </w:r>
             <w:r>
               <w:t xml:space="preserve"> </w:t>
@@ -684,7 +684,7 @@
         <w:pStyle w:val="BlockText"/>
       </w:pPr>
       <w:r>
-        <w:t xml:space="preserve">Première mise en PréProd de la solution Solution-ApplicationAppreciation (version 1.0.0.3, gérée). Contenu : 1 application canevas, 3 flux (Appréciation – Permissions à la création, Appréciation – Suivi des étapes, GenererPDFAppreciation), 5 variables d’environnement et 4 références de connexion (SharePoint Appreciation, Utilisateurs Office 365 Appreciations, Outlook Appreciations, OneDrive Appreciations). Connecteurs standard seulement, aucune licence Premium.</w:t>
+        <w:t xml:space="preserve">Première mise en PréProd de la solution Solution-ApplicationAppreciation (version 1.0.0.4, gérée). Contenu : 1 application canevas, 3 flux (Appréciation – Permissions à la création, Appréciation – Suivi des étapes, GenererPDFAppreciation), 5 variables d’environnement et 4 références de connexion (SharePoint Appreciation, Utilisateurs Office 365 Appreciations, Outlook Appreciations, OneDrive Appreciations). Connecteurs standard seulement, aucune licence Premium.</w:t>
       </w:r>
     </w:p>
     <w:p>
@@ -839,7 +839,7 @@
         <w:pStyle w:val="Compact"/>
       </w:pPr>
       <w:r>
-        <w:t xml:space="preserve">passez en version 1.0.0.3 ;</w:t>
+        <w:t xml:space="preserve">passez en version 1.0.0.4 ;</w:t>
       </w:r>
     </w:p>
     <w:p>

</xml_diff>

<commit_message>
Solution : 6 références de connexion documentées pour les TI
Co-Authored-By: Claude Opus 5.5 <noreply@anthropic.com>
Claude-Session: https://claude.ai/code/session_01FRdAzq8p3F9gJJe5MA3G79
</commit_message>
<xml_diff>
--- a/powerapps/DOSSIER-AUTORISATION-TI.docx
+++ b/powerapps/DOSSIER-AUTORISATION-TI.docx
@@ -684,7 +684,7 @@
         <w:pStyle w:val="BlockText"/>
       </w:pPr>
       <w:r>
-        <w:t xml:space="preserve">Première mise en PréProd de la solution Solution-ApplicationAppreciation (version 1.0.0.4, gérée). Contenu : 1 application canevas, 3 flux (Appréciation – Permissions à la création, Appréciation – Suivi des étapes, GenererPDFAppreciation), 5 variables d’environnement et 4 références de connexion (SharePoint Appreciation, Utilisateurs Office 365 Appreciations, Outlook Appreciations, OneDrive Appreciations). Connecteurs standard seulement, aucune licence Premium.</w:t>
+        <w:t xml:space="preserve">Première mise en PréProd de la solution Solution-ApplicationAppreciation (version 1.0.0.4, gérée). Contenu : 1 application canevas, 3 flux (Appréciation – Permissions à la création, Appréciation – Suivi des étapes, GenererPDFAppreciation), 6 variables d’environnement (SRHVQ_…) et 6 références de connexion (SharePoint Appreciations, Outlook Appreciations, Utilisateurs Office 365 Appreciations, OneDrive Entreprise RHDSSTDAAT-1b68d, SharePoint RHDSSTDAAT-11da3, Office 365 Outlook Gestion_formulaire_approb…). Connecteurs standard seulement, aucune licence Premium.</w:t>
       </w:r>
     </w:p>
     <w:p>
@@ -700,7 +700,7 @@
         <w:pStyle w:val="BlockText"/>
       </w:pPr>
       <w:r>
-        <w:t xml:space="preserve">Connexions : merci d’utiliser un compte de service, propriétaire du site, pour les 4 références de connexion.</w:t>
+        <w:t xml:space="preserve">Connexions : merci d’utiliser un compte de service, propriétaire du site, pour les 6 références de connexion. Le compte de service doit avoir une licence incluant OneDrive, avec un OneDrive initialisé (conversion PDF du flux GenererPDFAppreciation).</w:t>
       </w:r>
     </w:p>
     <w:p>

</xml_diff>